<commit_message>
Update NLP Streamlit app and project report
</commit_message>
<xml_diff>
--- a/HDSD.docx
+++ b/HDSD.docx
@@ -137,6 +137,66 @@
           <w:szCs w:val="28"/>
         </w:rPr>
         <w:t>Ctrl + C -&gt; dừng app.py</w:t>
+      </w:r>
+    </w:p>
+    <w:p>
+      <w:pPr>
+        <w:rPr>
+          <w:rFonts w:ascii="Times New Roman" w:hAnsi="Times New Roman" w:cs="Times New Roman"/>
+          <w:sz w:val="28"/>
+          <w:szCs w:val="28"/>
+        </w:rPr>
+      </w:pPr>
+    </w:p>
+    <w:p>
+      <w:pPr>
+        <w:rPr>
+          <w:rFonts w:ascii="Times New Roman" w:hAnsi="Times New Roman" w:cs="Times New Roman"/>
+          <w:sz w:val="28"/>
+          <w:szCs w:val="28"/>
+        </w:rPr>
+      </w:pPr>
+      <w:r>
+        <w:rPr>
+          <w:rFonts w:ascii="Times New Roman" w:hAnsi="Times New Roman" w:cs="Times New Roman"/>
+          <w:sz w:val="28"/>
+          <w:szCs w:val="28"/>
+        </w:rPr>
+        <w:t>Sửa lại giao diện bên chỗ MENU trông đẹp mắt và chuyên nghiệp hơn.</w:t>
+      </w:r>
+    </w:p>
+    <w:p>
+      <w:pPr>
+        <w:rPr>
+          <w:rFonts w:ascii="Times New Roman" w:hAnsi="Times New Roman" w:cs="Times New Roman"/>
+          <w:sz w:val="28"/>
+          <w:szCs w:val="28"/>
+        </w:rPr>
+      </w:pPr>
+      <w:r>
+        <w:rPr>
+          <w:rFonts w:ascii="Times New Roman" w:hAnsi="Times New Roman" w:cs="Times New Roman"/>
+          <w:sz w:val="28"/>
+          <w:szCs w:val="28"/>
+        </w:rPr>
+        <w:t>Database lưu lịch sử phân tích và bổ sung chức năng xóa lịch sử cho 1 lịch sử phân tích thôi, không nhất thiết phải xóa hết tất cả lịch sử.</w:t>
+      </w:r>
+    </w:p>
+    <w:p>
+      <w:pPr>
+        <w:rPr>
+          <w:rFonts w:ascii="Times New Roman" w:hAnsi="Times New Roman" w:cs="Times New Roman"/>
+          <w:sz w:val="28"/>
+          <w:szCs w:val="28"/>
+        </w:rPr>
+      </w:pPr>
+      <w:r>
+        <w:rPr>
+          <w:rFonts w:ascii="Times New Roman" w:hAnsi="Times New Roman" w:cs="Times New Roman"/>
+          <w:sz w:val="28"/>
+          <w:szCs w:val="28"/>
+        </w:rPr>
+        <w:t>Nhập văn bản từ file, có thể chọn 1 đoạn tùy ý trong file để phân tích và có thể tiếp tục chọn 1 đoạn khác để phân tích.</w:t>
       </w:r>
     </w:p>
     <w:p>

</xml_diff>